<commit_message>
docs: D-Agent là ví dụ agent tương lai, không phải ứng dụng thứ ba đang chạy (#254)
Bộ tài liệu nộp đang đặt D-Agent ngang hàng Q-Agent, kèm cả URL truy cập, nên
người đọc hiểu đây là sản phẩm đã hoàn chỉnh. Thực tế D-Agent chưa consume cấu
hình từ hub.

Suite hôm nay trình bày là EmeHub + Q-Agent. D-Agent và B-Agent xuất hiện đúng
một vai: ví dụ về agent plug vào sau qua cùng contract — không URL, không tài
khoản, không nằm trong luồng hướng dẫn.

Đổi cách này biến một điểm yếu thành một điểm kiến trúc: hub được thiết kế cho
nhiều agent, contract là document riêng, nên thêm agent là implement contract
chứ không phải sửa hub. Sơ đồ trong README.vi.md giờ vẽ Q-Agent ở "hôm nay" và
một ô "agent kế tiếp" trên cùng contract.

Bốn file, cả bốn đều là nguồn trong manifest. Đã rebuild, không warning.

Closes #254

Co-Authored-By: Claude Opus 5 (1M context) <noreply@anthropic.com>
Claude-Session: https://claude.ai/code/session_012TFaXeEbUHrdzx6vmb4qLN
</commit_message>
<xml_diff>
--- a/docs/submission/EmeHub - Diem noi bat.docx
+++ b/docs/submission/EmeHub - Diem noi bat.docx
@@ -17,7 +17,7 @@
     <w:p>
       <w:pPr/>
       <w:r>
-        <w:t xml:space="preserve">EMESOFT Agent Suite gồm ba ứng dụng dùng chung một identity provider và một kho cấu hình: </w:t>
+        <w:t xml:space="preserve">EMESOFT Agent Suite dùng chung một identity provider và một kho cấu hình: </w:t>
       </w:r>
       <w:r>
         <w:rPr>
@@ -35,16 +35,7 @@
         <w:t xml:space="preserve">Q-Agent</w:t>
       </w:r>
       <w:r>
-        <w:t xml:space="preserve"> chạy pipeline QA; </w:t>
-      </w:r>
-      <w:r>
-        <w:rPr>
-          <w:b/>
-        </w:rPr>
-        <w:t xml:space="preserve">D-Agent</w:t>
-      </w:r>
-      <w:r>
-        <w:t xml:space="preserve"> chạy việc của dev.</w:t>
+        <w:t xml:space="preserve"> chạy pipeline QA. Agent khác — D-Agent cho dev, B-Agent cho BA — plug vào qua cùng contract mà không phải sửa hub (§7).</w:t>
       </w:r>
     </w:p>
     <w:p>
@@ -1650,7 +1641,7 @@
         <w:t xml:space="preserve">hub.chuongnd.click</w:t>
       </w:r>
       <w:r>
-        <w:t xml:space="preserve">, </w:t>
+        <w:t xml:space="preserve"> và </w:t>
       </w:r>
       <w:r>
         <w:rPr>
@@ -1659,16 +1650,7 @@
         <w:t xml:space="preserve">hub.chuongnd.click/qagent/</w:t>
       </w:r>
       <w:r>
-        <w:t xml:space="preserve">, </w:t>
-      </w:r>
-      <w:r>
-        <w:rPr>
-          <w:rFonts w:ascii="Consolas" w:hAnsi="Consolas"/>
-        </w:rPr>
-        <w:t xml:space="preserve">hub.chuongnd.click/dagent</w:t>
-      </w:r>
-      <w:r>
-        <w:t xml:space="preserve">.</w:t>
+        <w:t xml:space="preserve">. Agent thêm vào chiếm một path segment mới, không phải một origin mới.</w:t>
       </w:r>
     </w:p>
     <w:p>

</xml_diff>

<commit_message>
docs: D-Agent là ví dụ agent tương lai, không phải ứng dụng thứ ba đang chạy (#254) (#255)
Bộ tài liệu nộp đang đặt D-Agent ngang hàng Q-Agent, kèm cả URL truy cập, nên
người đọc hiểu đây là sản phẩm đã hoàn chỉnh. Thực tế D-Agent chưa consume cấu
hình từ hub.

Suite hôm nay trình bày là EmeHub + Q-Agent. D-Agent và B-Agent xuất hiện đúng
một vai: ví dụ về agent plug vào sau qua cùng contract — không URL, không tài
khoản, không nằm trong luồng hướng dẫn.

Đổi cách này biến một điểm yếu thành một điểm kiến trúc: hub được thiết kế cho
nhiều agent, contract là document riêng, nên thêm agent là implement contract
chứ không phải sửa hub. Sơ đồ trong README.vi.md giờ vẽ Q-Agent ở "hôm nay" và
một ô "agent kế tiếp" trên cùng contract.

Bốn file, cả bốn đều là nguồn trong manifest. Đã rebuild, không warning.

Closes #254


Claude-Session: https://claude.ai/code/session_012TFaXeEbUHrdzx6vmb4qLN

Co-authored-by: Claude Opus 5 (1M context) <noreply@anthropic.com>
</commit_message>
<xml_diff>
--- a/docs/submission/EmeHub - Diem noi bat.docx
+++ b/docs/submission/EmeHub - Diem noi bat.docx
@@ -17,7 +17,7 @@
     <w:p>
       <w:pPr/>
       <w:r>
-        <w:t xml:space="preserve">EMESOFT Agent Suite gồm ba ứng dụng dùng chung một identity provider và một kho cấu hình: </w:t>
+        <w:t xml:space="preserve">EMESOFT Agent Suite dùng chung một identity provider và một kho cấu hình: </w:t>
       </w:r>
       <w:r>
         <w:rPr>
@@ -35,16 +35,7 @@
         <w:t xml:space="preserve">Q-Agent</w:t>
       </w:r>
       <w:r>
-        <w:t xml:space="preserve"> chạy pipeline QA; </w:t>
-      </w:r>
-      <w:r>
-        <w:rPr>
-          <w:b/>
-        </w:rPr>
-        <w:t xml:space="preserve">D-Agent</w:t>
-      </w:r>
-      <w:r>
-        <w:t xml:space="preserve"> chạy việc của dev.</w:t>
+        <w:t xml:space="preserve"> chạy pipeline QA. Agent khác — D-Agent cho dev, B-Agent cho BA — plug vào qua cùng contract mà không phải sửa hub (§7).</w:t>
       </w:r>
     </w:p>
     <w:p>
@@ -1650,7 +1641,7 @@
         <w:t xml:space="preserve">hub.chuongnd.click</w:t>
       </w:r>
       <w:r>
-        <w:t xml:space="preserve">, </w:t>
+        <w:t xml:space="preserve"> và </w:t>
       </w:r>
       <w:r>
         <w:rPr>
@@ -1659,16 +1650,7 @@
         <w:t xml:space="preserve">hub.chuongnd.click/qagent/</w:t>
       </w:r>
       <w:r>
-        <w:t xml:space="preserve">, </w:t>
-      </w:r>
-      <w:r>
-        <w:rPr>
-          <w:rFonts w:ascii="Consolas" w:hAnsi="Consolas"/>
-        </w:rPr>
-        <w:t xml:space="preserve">hub.chuongnd.click/dagent</w:t>
-      </w:r>
-      <w:r>
-        <w:t xml:space="preserve">.</w:t>
+        <w:t xml:space="preserve">. Agent thêm vào chiếm một path segment mới, không phải một origin mới.</w:t>
       </w:r>
     </w:p>
     <w:p>

</xml_diff>